<commit_message>
Volume 1, Chapter 7: each language uses its own tables and folders; every setup step tested
</commit_message>
<xml_diff>
--- a/Volume 1/Chapter 07 - Networking Basics/SPA_Vol1_Ch7_Lesson7_10_TCP_Sockets.docx
+++ b/Volume 1/Chapter 07 - Networking Basics/SPA_Vol1_Ch7_Lesson7_10_TCP_Sockets.docx
@@ -1038,7 +1038,7 @@
         <w:keepNext/>
       </w:pPr>
       <w:r>
-        <w:t>Save each source and supporting file from this lesson into the matching path in the project layout. As in Chapter 1, notepad .\c\basic_echo_server.c creates and opens one: choose Yes, type the file, save it with Ctrl+S, and close Notepad (on Linux or macOS, nano ./c/basic_echo_server.c: type the file, then save and close it with Ctrl+O, Enter, then Ctrl+X). Then install the TypeScript compiler for this project.</w:t>
+        <w:t>Next, let the tools create each project's settings file, as in Chapter 1. Remember, -o names the project folder; the starter Program.cs is replaced by this lesson's code in the C# section. Remember, go mod init makes the .\go folder a module; the go line shows your own Go version.</w:t>
       </w:r>
     </w:p>
     <w:p>
@@ -1049,9 +1049,316 @@
     <w:p>
       <w:pPr>
         <w:pStyle w:val="CommandBlock"/>
-      </w:pPr>
-      <w:r>
-        <w:t>npm --prefix .\typescript install --ignore-scripts --no-audit --no-fund</w:t>
+        <w:keepNext/>
+      </w:pPr>
+      <w:r>
+        <w:t>dotnet new console -o .\csharp\BasicEchoServer</w:t>
+      </w:r>
+    </w:p>
+    <w:p>
+      <w:pPr>
+        <w:pStyle w:val="CommandBlock"/>
+        <w:keepNext/>
+      </w:pPr>
+      <w:r>
+        <w:t>dotnet new console -o .\csharp\BasicEchoClient</w:t>
+      </w:r>
+    </w:p>
+    <w:p>
+      <w:pPr>
+        <w:pStyle w:val="CommandBlock"/>
+        <w:keepNext/>
+      </w:pPr>
+      <w:r>
+        <w:t>dotnet new console -o .\csharp\EchoServer</w:t>
+      </w:r>
+    </w:p>
+    <w:p>
+      <w:pPr>
+        <w:pStyle w:val="CommandBlock"/>
+        <w:keepNext/>
+      </w:pPr>
+      <w:r>
+        <w:t>dotnet new console -o .\csharp\EchoClient</w:t>
+      </w:r>
+    </w:p>
+    <w:p>
+      <w:pPr>
+        <w:pStyle w:val="CommandBlock"/>
+      </w:pPr>
+      <w:r>
+        <w:t>go -C .\go mod init example.com/tcpsockets</w:t>
+      </w:r>
+    </w:p>
+    <w:p>
+      <w:pPr>
+        <w:keepNext/>
+      </w:pPr>
+    </w:p>
+    <w:p>
+      <w:pPr>
+        <w:keepNext/>
+      </w:pPr>
+      <w:r>
+        <w:t>Remember, npm init -y, npm pkg, then npm install.</w:t>
+      </w:r>
+    </w:p>
+    <w:p>
+      <w:pPr>
+        <w:keepNext/>
+      </w:pPr>
+    </w:p>
+    <w:p>
+      <w:pPr>
+        <w:pStyle w:val="CommandBlock"/>
+        <w:keepNext/>
+      </w:pPr>
+      <w:r>
+        <w:t>Push-Location .\typescript</w:t>
+      </w:r>
+    </w:p>
+    <w:p>
+      <w:pPr>
+        <w:pStyle w:val="CommandBlock"/>
+        <w:keepNext/>
+      </w:pPr>
+      <w:r>
+        <w:t>npm init -y</w:t>
+      </w:r>
+    </w:p>
+    <w:p>
+      <w:pPr>
+        <w:pStyle w:val="CommandBlock"/>
+        <w:keepNext/>
+      </w:pPr>
+      <w:r>
+        <w:t>npm pkg set name=tcp-sockets-typescript type=module</w:t>
+      </w:r>
+    </w:p>
+    <w:p>
+      <w:pPr>
+        <w:pStyle w:val="CommandBlock"/>
+        <w:keepNext/>
+      </w:pPr>
+      <w:r>
+        <w:t>npm pkg set private=true --json</w:t>
+      </w:r>
+    </w:p>
+    <w:p>
+      <w:pPr>
+        <w:pStyle w:val="CommandBlock"/>
+        <w:keepNext/>
+      </w:pPr>
+      <w:r>
+        <w:t>npm pkg set "scripts.check=tsc --noEmit" "scripts.build=tsc --noEmitOnError"</w:t>
+      </w:r>
+    </w:p>
+    <w:p>
+      <w:pPr>
+        <w:pStyle w:val="CommandBlock"/>
+        <w:keepNext/>
+      </w:pPr>
+      <w:r>
+        <w:t>npm pkg delete version description main keywords author license scripts.test</w:t>
+      </w:r>
+    </w:p>
+    <w:p>
+      <w:pPr>
+        <w:pStyle w:val="CommandBlock"/>
+        <w:keepNext/>
+      </w:pPr>
+      <w:r>
+        <w:t>npm install --save-dev --save-exact typescript@7.0.2 @types/node@24.13.5 `</w:t>
+      </w:r>
+    </w:p>
+    <w:p>
+      <w:pPr>
+        <w:pStyle w:val="CommandBlock"/>
+        <w:keepNext/>
+      </w:pPr>
+      <w:r>
+        <w:t xml:space="preserve">    --ignore-scripts --no-audit --no-fund</w:t>
+      </w:r>
+    </w:p>
+    <w:p>
+      <w:pPr>
+        <w:pStyle w:val="CommandBlock"/>
+      </w:pPr>
+      <w:r>
+        <w:t>Pop-Location</w:t>
+      </w:r>
+    </w:p>
+    <w:p>
+      <w:pPr>
+        <w:keepNext/>
+      </w:pPr>
+    </w:p>
+    <w:p>
+      <w:r>
+        <w:t>Then type the TypeScript compiler settings. As in Chapter 1, notepad .\typescript\tsconfig.json creates and opens the file: choose Yes, type the file, save it with Ctrl+S, and close Notepad.</w:t>
+      </w:r>
+    </w:p>
+    <w:p>
+      <w:pPr>
+        <w:keepNext/>
+      </w:pPr>
+    </w:p>
+    <w:p>
+      <w:pPr>
+        <w:pStyle w:val="Heading3"/>
+      </w:pPr>
+      <w:r>
+        <w:t>typescript/tsconfig.json</w:t>
+      </w:r>
+    </w:p>
+    <w:p>
+      <w:pPr>
+        <w:pStyle w:val="SourceCode"/>
+        <w:keepNext/>
+      </w:pPr>
+      <w:r>
+        <w:t>{</w:t>
+      </w:r>
+    </w:p>
+    <w:p>
+      <w:pPr>
+        <w:pStyle w:val="SourceCode"/>
+        <w:keepNext/>
+      </w:pPr>
+      <w:r>
+        <w:t xml:space="preserve">  "compilerOptions": {</w:t>
+      </w:r>
+    </w:p>
+    <w:p>
+      <w:pPr>
+        <w:pStyle w:val="SourceCode"/>
+      </w:pPr>
+      <w:r>
+        <w:t xml:space="preserve">    "target": "ES2022",</w:t>
+      </w:r>
+    </w:p>
+    <w:p>
+      <w:pPr>
+        <w:pStyle w:val="SourceCode"/>
+      </w:pPr>
+      <w:r>
+        <w:t xml:space="preserve">    "module": "NodeNext",</w:t>
+      </w:r>
+    </w:p>
+    <w:p>
+      <w:pPr>
+        <w:pStyle w:val="SourceCode"/>
+      </w:pPr>
+      <w:r>
+        <w:t xml:space="preserve">    "moduleResolution": "NodeNext",</w:t>
+      </w:r>
+    </w:p>
+    <w:p>
+      <w:pPr>
+        <w:pStyle w:val="SourceCode"/>
+      </w:pPr>
+      <w:r>
+        <w:t xml:space="preserve">    "rootDir": "src",</w:t>
+      </w:r>
+    </w:p>
+    <w:p>
+      <w:pPr>
+        <w:pStyle w:val="SourceCode"/>
+      </w:pPr>
+      <w:r>
+        <w:t xml:space="preserve">    "outDir": "dist",</w:t>
+      </w:r>
+    </w:p>
+    <w:p>
+      <w:pPr>
+        <w:pStyle w:val="SourceCode"/>
+      </w:pPr>
+      <w:r>
+        <w:t xml:space="preserve">    "strict": true,</w:t>
+      </w:r>
+    </w:p>
+    <w:p>
+      <w:pPr>
+        <w:pStyle w:val="SourceCode"/>
+      </w:pPr>
+      <w:r>
+        <w:t xml:space="preserve">    "types": [</w:t>
+      </w:r>
+    </w:p>
+    <w:p>
+      <w:pPr>
+        <w:pStyle w:val="SourceCode"/>
+      </w:pPr>
+      <w:r>
+        <w:t xml:space="preserve">      "node"</w:t>
+      </w:r>
+    </w:p>
+    <w:p>
+      <w:pPr>
+        <w:pStyle w:val="SourceCode"/>
+      </w:pPr>
+      <w:r>
+        <w:t xml:space="preserve">    ],</w:t>
+      </w:r>
+    </w:p>
+    <w:p>
+      <w:pPr>
+        <w:pStyle w:val="SourceCode"/>
+      </w:pPr>
+      <w:r>
+        <w:t xml:space="preserve">    "moduleDetection": "force"</w:t>
+      </w:r>
+    </w:p>
+    <w:p>
+      <w:pPr>
+        <w:pStyle w:val="SourceCode"/>
+      </w:pPr>
+      <w:r>
+        <w:t xml:space="preserve">  },</w:t>
+      </w:r>
+    </w:p>
+    <w:p>
+      <w:pPr>
+        <w:pStyle w:val="SourceCode"/>
+      </w:pPr>
+      <w:r>
+        <w:t xml:space="preserve">  "include": [</w:t>
+      </w:r>
+    </w:p>
+    <w:p>
+      <w:pPr>
+        <w:pStyle w:val="SourceCode"/>
+        <w:keepNext/>
+      </w:pPr>
+      <w:r>
+        <w:t xml:space="preserve">    "src/**/*.ts"</w:t>
+      </w:r>
+    </w:p>
+    <w:p>
+      <w:pPr>
+        <w:pStyle w:val="SourceCode"/>
+        <w:keepNext/>
+      </w:pPr>
+      <w:r>
+        <w:t xml:space="preserve">  ]</w:t>
+      </w:r>
+    </w:p>
+    <w:p>
+      <w:pPr>
+        <w:pStyle w:val="SourceCode"/>
+      </w:pPr>
+      <w:r>
+        <w:t>}</w:t>
+      </w:r>
+    </w:p>
+    <w:p>
+      <w:pPr>
+        <w:keepNext/>
+      </w:pPr>
+    </w:p>
+    <w:p>
+      <w:r>
+        <w:t>You save each source file in its language's section below, as each is shown. As in Chapter 1, notepad .\c\basic_echo_server.c creates and opens one: choose Yes, type the file, save it with Ctrl+S, and close Notepad (on Linux or macOS, nano ./c/basic_echo_server.c: type the file, then save and close it with Ctrl+O, Enter, then Ctrl+X).</w:t>
       </w:r>
     </w:p>
     <w:p>
@@ -1124,7 +1431,6 @@
     <w:p>
       <w:pPr>
         <w:pStyle w:val="CommandBlock"/>
-        <w:keepNext/>
       </w:pPr>
       <w:r>
         <w:t>cd "$HOME/spa/lesson-7.10"</w:t>
@@ -1132,97 +1438,39 @@
     </w:p>
     <w:p>
       <w:pPr>
+        <w:keepNext/>
+      </w:pPr>
+    </w:p>
+    <w:p>
+      <w:pPr>
+        <w:keepNext/>
+      </w:pPr>
+      <w:r>
+        <w:t>Then create the C#, Go, and TypeScript project files with the same commands as on Windows; cd moves into ./typescript for the npm lines, and cd .. moves back.</w:t>
+      </w:r>
+    </w:p>
+    <w:p>
+      <w:pPr>
+        <w:keepNext/>
+      </w:pPr>
+    </w:p>
+    <w:p>
+      <w:pPr>
         <w:pStyle w:val="CommandBlock"/>
-      </w:pPr>
-      <w:r>
-        <w:t>npm --prefix ./typescript install --ignore-scripts --no-audit --no-fund</w:t>
-      </w:r>
-    </w:p>
-    <w:p>
-      <w:pPr>
-        <w:keepNext/>
-      </w:pPr>
-    </w:p>
-    <w:p>
-      <w:pPr>
-        <w:keepNext/>
-      </w:pPr>
-    </w:p>
-    <w:p>
-      <w:pPr>
-        <w:pStyle w:val="Heading2"/>
-      </w:pPr>
-      <w:r>
-        <w:t>Watching a Connection</w:t>
-      </w:r>
-    </w:p>
-    <w:p>
-      <w:r>
-        <w:t>Before the programs, watch one TCP connection's life in the operating system's connection list. The server is this lesson's Python Production-Minded server, which needs no build; the Python Implementation explains it, and every language's server behaves the same. Remember, Terminal 1 runs the server and Terminal 2, a second PowerShell window in the same lesson-7.10 folder, runs the checks.</w:t>
-      </w:r>
-    </w:p>
-    <w:p>
-      <w:pPr>
-        <w:keepNext/>
-      </w:pPr>
-    </w:p>
-    <w:p>
-      <w:pPr>
-        <w:pStyle w:val="Heading3"/>
-      </w:pPr>
-      <w:r>
-        <w:t>Windows PowerShell Terminal 1: Start the Server</w:t>
+        <w:keepNext/>
+      </w:pPr>
+      <w:r>
+        <w:t>dotnet new console -o ./csharp/BasicEchoServer</w:t>
       </w:r>
     </w:p>
     <w:p>
       <w:pPr>
         <w:pStyle w:val="CommandBlock"/>
-      </w:pPr>
-      <w:r>
-        <w:t>py .\python\echo_server.py</w:t>
-      </w:r>
-    </w:p>
-    <w:p>
-      <w:pPr>
-        <w:keepNext/>
-      </w:pPr>
-    </w:p>
-    <w:p>
-      <w:pPr>
-        <w:pStyle w:val="RequiredOutput"/>
-      </w:pPr>
-      <w:r>
-        <w:t>Listening on tcp://127.0.0.1:8766</w:t>
-      </w:r>
-    </w:p>
-    <w:p>
-      <w:pPr>
-        <w:keepNext/>
-      </w:pPr>
-    </w:p>
-    <w:p>
-      <w:pPr>
-        <w:pStyle w:val="Heading3"/>
-      </w:pPr>
-      <w:r>
-        <w:t>Windows PowerShell Terminal 2: One Connection, Open Then Closed</w:t>
-      </w:r>
-    </w:p>
-    <w:p>
-      <w:pPr>
-        <w:keepNext/>
-      </w:pPr>
-      <w:r>
-        <w:t>The client here is PowerShell's own: PowerShell can use any .NET class, and [System.Net.Sockets.TcpClient]::new("127.0.0.1", 8766) creates the same TcpClient the C# programs use and connects it. $clientPort holds the port Windows lent it. Remember, Get-NetTCPConnection lists TCP endpoints, -LocalPort and -RemotePort keep the ones that match, and State says what each one is doing (Lesson 7.7). The server's end of the connection has the client's port as its RemotePort, and the client's end has it as its Local</w:t>
-      </w:r>
-      <w:r>
-        <w:t>Port, with RemotePort 8766 (Windows also lists a Bound entry for the client's port, which -RemotePort leaves out). Close closes the client's end; Start-Sleep -Seconds 1 waits one second, so the server can close its end too. Paste the whole block at once: the server gives a silent client only 3000 milliseconds.</w:t>
-      </w:r>
-    </w:p>
-    <w:p>
-      <w:pPr>
-        <w:keepNext/>
-      </w:pPr>
+        <w:keepNext/>
+      </w:pPr>
+      <w:r>
+        <w:t>dotnet new console -o ./csharp/BasicEchoClient</w:t>
+      </w:r>
     </w:p>
     <w:p>
       <w:pPr>
@@ -1230,7 +1478,7 @@
         <w:keepNext/>
       </w:pPr>
       <w:r>
-        <w:t>(Get-NetTCPConnection -LocalPort 8766 -State Listen).LocalAddress</w:t>
+        <w:t>dotnet new console -o ./csharp/EchoServer</w:t>
       </w:r>
     </w:p>
     <w:p>
@@ -1239,7 +1487,7 @@
         <w:keepNext/>
       </w:pPr>
       <w:r>
-        <w:t>$connection = [System.Net.Sockets.TcpClient]::new("127.0.0.1", 8766)</w:t>
+        <w:t>dotnet new console -o ./csharp/EchoClient</w:t>
       </w:r>
     </w:p>
     <w:p>
@@ -1248,7 +1496,7 @@
         <w:keepNext/>
       </w:pPr>
       <w:r>
-        <w:t>$clientPort = $connection.Client.LocalEndPoint.Port</w:t>
+        <w:t>go -C ./go mod init example.com/tcpsockets</w:t>
       </w:r>
     </w:p>
     <w:p>
@@ -1257,7 +1505,7 @@
         <w:keepNext/>
       </w:pPr>
       <w:r>
-        <w:t>$clientPort -ge 49152</w:t>
+        <w:t>cd ./typescript</w:t>
       </w:r>
     </w:p>
     <w:p>
@@ -1266,7 +1514,7 @@
         <w:keepNext/>
       </w:pPr>
       <w:r>
-        <w:t>(Get-NetTCPConnection -RemotePort $clientPort).State</w:t>
+        <w:t>npm init -y</w:t>
       </w:r>
     </w:p>
     <w:p>
@@ -1275,7 +1523,7 @@
         <w:keepNext/>
       </w:pPr>
       <w:r>
-        <w:t>(Get-NetTCPConnection -LocalPort $clientPort -RemotePort 8766).State</w:t>
+        <w:t>npm pkg set name=tcp-sockets-typescript type=module</w:t>
       </w:r>
     </w:p>
     <w:p>
@@ -1284,7 +1532,7 @@
         <w:keepNext/>
       </w:pPr>
       <w:r>
-        <w:t>$connection.Close()</w:t>
+        <w:t>npm pkg set private=true --json</w:t>
       </w:r>
     </w:p>
     <w:p>
@@ -1293,7 +1541,7 @@
         <w:keepNext/>
       </w:pPr>
       <w:r>
-        <w:t>Start-Sleep -Seconds 1</w:t>
+        <w:t>npm pkg set "scripts.check=tsc --noEmit" "scripts.build=tsc --noEmitOnError"</w:t>
       </w:r>
     </w:p>
     <w:p>
@@ -1302,147 +1550,16 @@
         <w:keepNext/>
       </w:pPr>
       <w:r>
-        <w:t>(Get-NetTCPConnection -LocalPort $clientPort -RemotePort 8766).State</w:t>
+        <w:t>npm pkg delete version description main keywords author license scripts.test</w:t>
       </w:r>
     </w:p>
     <w:p>
       <w:pPr>
         <w:pStyle w:val="CommandBlock"/>
-      </w:pPr>
-      <w:r>
-        <w:t>(Get-NetTCPConnection -RemotePort $clientPort -ErrorAction Ignore).Count</w:t>
-      </w:r>
-    </w:p>
-    <w:p>
-      <w:pPr>
-        <w:keepNext/>
-      </w:pPr>
-    </w:p>
-    <w:p>
-      <w:pPr>
-        <w:keepNext/>
-      </w:pPr>
-      <w:r>
-        <w:t>The listener is on 127.0.0.1; the client's port is a dynamic port, from 49152 on; both ends of the open connection are Established. After the close, the client's end, which closed first, is in TimeWait, and the server's end is gone:</w:t>
-      </w:r>
-    </w:p>
-    <w:p>
-      <w:pPr>
-        <w:keepNext/>
-      </w:pPr>
-    </w:p>
-    <w:p>
-      <w:pPr>
-        <w:pStyle w:val="RequiredOutput"/>
-        <w:keepNext/>
-      </w:pPr>
-      <w:r>
-        <w:t>127.0.0.1</w:t>
-      </w:r>
-    </w:p>
-    <w:p>
-      <w:pPr>
-        <w:pStyle w:val="RequiredOutput"/>
-        <w:keepNext/>
-      </w:pPr>
-      <w:r>
-        <w:t>True</w:t>
-      </w:r>
-    </w:p>
-    <w:p>
-      <w:pPr>
-        <w:pStyle w:val="RequiredOutput"/>
-        <w:keepNext/>
-      </w:pPr>
-      <w:r>
-        <w:t>Established</w:t>
-      </w:r>
-    </w:p>
-    <w:p>
-      <w:pPr>
-        <w:pStyle w:val="RequiredOutput"/>
-        <w:keepNext/>
-      </w:pPr>
-      <w:r>
-        <w:t>Established</w:t>
-      </w:r>
-    </w:p>
-    <w:p>
-      <w:pPr>
-        <w:pStyle w:val="RequiredOutput"/>
-        <w:keepNext/>
-      </w:pPr>
-      <w:r>
-        <w:t>TimeWait</w:t>
-      </w:r>
-    </w:p>
-    <w:p>
-      <w:pPr>
-        <w:pStyle w:val="RequiredOutput"/>
-      </w:pPr>
-      <w:r>
-        <w:t>0</w:t>
-      </w:r>
-    </w:p>
-    <w:p>
-      <w:pPr>
-        <w:keepNext/>
-      </w:pPr>
-    </w:p>
-    <w:p>
-      <w:r>
-        <w:t>If more than 3000 milliseconds pass before the Close line, for example when you type the lines one by one, the server gives up and closes first: Terminal 1 shows Error: no line from the client within 3000 ms, and the roles turn round. The server's end shows FinWait2, closed and waiting for the client's side, instead of the first Established, and the client's end shows CloseWait, the other side closed and this side not yet, instead of the second. After your Close, the client's end is gone at once, so the Tim</w:t>
-      </w:r>
-      <w:r>
-        <w:t>eWait line prints an error instead, and the count is 1: the server's end, which closed first, is the one in TimeWait.</w:t>
-      </w:r>
-    </w:p>
-    <w:p>
-      <w:pPr>
-        <w:keepNext/>
-      </w:pPr>
-    </w:p>
-    <w:p>
-      <w:pPr>
-        <w:keepNext/>
-      </w:pPr>
-      <w:r>
-        <w:t>Now press Ctrl+C in Terminal 1. Terminal 1 shows the Listening line and one line for the connection, which ended without a line:</w:t>
-      </w:r>
-    </w:p>
-    <w:p>
-      <w:pPr>
-        <w:keepNext/>
-      </w:pPr>
-    </w:p>
-    <w:p>
-      <w:pPr>
-        <w:pStyle w:val="RequiredOutput"/>
-        <w:keepNext/>
-      </w:pPr>
-      <w:r>
-        <w:t>Listening on tcp://127.0.0.1:8766</w:t>
-      </w:r>
-    </w:p>
-    <w:p>
-      <w:pPr>
-        <w:pStyle w:val="RequiredOutput"/>
-      </w:pPr>
-      <w:r>
-        <w:t>No line: the client closed the connection</w:t>
-      </w:r>
-    </w:p>
-    <w:p>
-      <w:pPr>
-        <w:keepNext/>
-      </w:pPr>
-    </w:p>
-    <w:p>
-      <w:pPr>
-        <w:pStyle w:val="Heading3"/>
-      </w:pPr>
-      <w:r>
-        <w:t>Linux or macOS Observation</w:t>
+        <w:keepNext/>
+      </w:pPr>
+      <w:r>
+        <w:t>npm install --save-dev --save-exact typescript@7.0.2 @types/node@24.13.5 \</w:t>
       </w:r>
     </w:p>
     <w:p>
@@ -1451,60 +1568,25 @@
         <w:keepNext/>
       </w:pPr>
       <w:r>
-        <w:t># Terminal 1:</w:t>
+        <w:t xml:space="preserve">    --ignore-scripts --no-audit --no-fund</w:t>
       </w:r>
     </w:p>
     <w:p>
       <w:pPr>
         <w:pStyle w:val="CommandBlock"/>
-        <w:keepNext/>
-      </w:pPr>
-      <w:r>
-        <w:t>python3 ./python/echo_server.py</w:t>
-      </w:r>
-    </w:p>
-    <w:p>
-      <w:pPr>
-        <w:pStyle w:val="CommandBlock"/>
-        <w:keepNext/>
-      </w:pPr>
-      <w:r>
-        <w:t># Terminal 2: ss lists TCP endpoints: -t TCP, -a every state, -n numbers</w:t>
-      </w:r>
-    </w:p>
-    <w:p>
-      <w:pPr>
-        <w:pStyle w:val="CommandBlock"/>
-        <w:keepNext/>
-      </w:pPr>
-      <w:r>
-        <w:t># (macOS: netstat -an -p tcp | grep 8766)</w:t>
-      </w:r>
-    </w:p>
-    <w:p>
-      <w:pPr>
-        <w:pStyle w:val="CommandBlock"/>
-        <w:keepNext/>
-      </w:pPr>
-      <w:r>
-        <w:t>ss -tan 'sport = :8766'</w:t>
-      </w:r>
-    </w:p>
-    <w:p>
-      <w:pPr>
-        <w:pStyle w:val="CommandBlock"/>
-        <w:keepNext/>
-      </w:pPr>
-      <w:r>
-        <w:t>python3 ./python/echo_client.py</w:t>
-      </w:r>
-    </w:p>
-    <w:p>
-      <w:pPr>
-        <w:pStyle w:val="CommandBlock"/>
-      </w:pPr>
-      <w:r>
-        <w:t>ss -tan 'sport = :8766 or dport = :8766'</w:t>
+      </w:pPr>
+      <w:r>
+        <w:t>cd ..</w:t>
+      </w:r>
+    </w:p>
+    <w:p>
+      <w:pPr>
+        <w:keepNext/>
+      </w:pPr>
+    </w:p>
+    <w:p>
+      <w:r>
+        <w:t>Type typescript/tsconfig.json exactly as shown in the Windows setup.</w:t>
       </w:r>
     </w:p>
     <w:p>
@@ -21607,6 +21689,375 @@
         <w:pStyle w:val="Heading2"/>
       </w:pPr>
       <w:r>
+        <w:t>Watching a Connection</w:t>
+      </w:r>
+    </w:p>
+    <w:p>
+      <w:r>
+        <w:t>Now that you have the Python programs, watch one TCP connection's life in the operating system's connection list. The server is the Python Production-Minded server above, which needs no build, and every language's server behaves the same. Remember, Terminal 1 runs the server and Terminal 2, a second PowerShell window in the same lesson-7.10 folder, runs the checks.</w:t>
+      </w:r>
+    </w:p>
+    <w:p>
+      <w:pPr>
+        <w:keepNext/>
+      </w:pPr>
+    </w:p>
+    <w:p>
+      <w:pPr>
+        <w:pStyle w:val="Heading3"/>
+      </w:pPr>
+      <w:r>
+        <w:t>Windows PowerShell Terminal 1: Start the Server</w:t>
+      </w:r>
+    </w:p>
+    <w:p>
+      <w:pPr>
+        <w:pStyle w:val="CommandBlock"/>
+      </w:pPr>
+      <w:r>
+        <w:t>py .\python\echo_server.py</w:t>
+      </w:r>
+    </w:p>
+    <w:p>
+      <w:pPr>
+        <w:keepNext/>
+      </w:pPr>
+    </w:p>
+    <w:p>
+      <w:pPr>
+        <w:pStyle w:val="RequiredOutput"/>
+      </w:pPr>
+      <w:r>
+        <w:t>Listening on tcp://127.0.0.1:8766</w:t>
+      </w:r>
+    </w:p>
+    <w:p>
+      <w:pPr>
+        <w:keepNext/>
+      </w:pPr>
+    </w:p>
+    <w:p>
+      <w:pPr>
+        <w:pStyle w:val="Heading3"/>
+      </w:pPr>
+      <w:r>
+        <w:t>Windows PowerShell Terminal 2: One Connection, Open Then Closed</w:t>
+      </w:r>
+    </w:p>
+    <w:p>
+      <w:pPr>
+        <w:keepNext/>
+      </w:pPr>
+      <w:r>
+        <w:t>The client here is PowerShell's own: PowerShell can use any .NET class, and [System.Net.Sockets.TcpClient]::new("127.0.0.1", 8766) creates the same TcpClient the C# programs use and connects it. $clientPort holds the port Windows lent it. Remember, Get-NetTCPConnection lists TCP endpoints, -LocalPort and -RemotePort keep the ones that match, and State says what each one is doing (Lesson 7.7). The server's end of the connection has the client's port as its RemotePort, and the client's end has it as its Local</w:t>
+      </w:r>
+      <w:r>
+        <w:t>Port, with RemotePort 8766 (Windows also lists a Bound entry for the client's port, which -RemotePort leaves out). Close closes the client's end; Start-Sleep -Seconds 1 waits one second, so the server can close its end too. Paste the whole block at once: the server gives a silent client only 3000 milliseconds.</w:t>
+      </w:r>
+    </w:p>
+    <w:p>
+      <w:pPr>
+        <w:keepNext/>
+      </w:pPr>
+    </w:p>
+    <w:p>
+      <w:pPr>
+        <w:pStyle w:val="CommandBlock"/>
+        <w:keepNext/>
+      </w:pPr>
+      <w:r>
+        <w:t>(Get-NetTCPConnection -LocalPort 8766 -State Listen).LocalAddress</w:t>
+      </w:r>
+    </w:p>
+    <w:p>
+      <w:pPr>
+        <w:pStyle w:val="CommandBlock"/>
+        <w:keepNext/>
+      </w:pPr>
+      <w:r>
+        <w:t>$connection = [System.Net.Sockets.TcpClient]::new("127.0.0.1", 8766)</w:t>
+      </w:r>
+    </w:p>
+    <w:p>
+      <w:pPr>
+        <w:pStyle w:val="CommandBlock"/>
+        <w:keepNext/>
+      </w:pPr>
+      <w:r>
+        <w:t>$clientPort = $connection.Client.LocalEndPoint.Port</w:t>
+      </w:r>
+    </w:p>
+    <w:p>
+      <w:pPr>
+        <w:pStyle w:val="CommandBlock"/>
+        <w:keepNext/>
+      </w:pPr>
+      <w:r>
+        <w:t>$clientPort -ge 49152</w:t>
+      </w:r>
+    </w:p>
+    <w:p>
+      <w:pPr>
+        <w:pStyle w:val="CommandBlock"/>
+        <w:keepNext/>
+      </w:pPr>
+      <w:r>
+        <w:t>(Get-NetTCPConnection -RemotePort $clientPort).State</w:t>
+      </w:r>
+    </w:p>
+    <w:p>
+      <w:pPr>
+        <w:pStyle w:val="CommandBlock"/>
+        <w:keepNext/>
+      </w:pPr>
+      <w:r>
+        <w:t>(Get-NetTCPConnection -LocalPort $clientPort -RemotePort 8766).State</w:t>
+      </w:r>
+    </w:p>
+    <w:p>
+      <w:pPr>
+        <w:pStyle w:val="CommandBlock"/>
+        <w:keepNext/>
+      </w:pPr>
+      <w:r>
+        <w:t>$connection.Close()</w:t>
+      </w:r>
+    </w:p>
+    <w:p>
+      <w:pPr>
+        <w:pStyle w:val="CommandBlock"/>
+        <w:keepNext/>
+      </w:pPr>
+      <w:r>
+        <w:t>Start-Sleep -Seconds 1</w:t>
+      </w:r>
+    </w:p>
+    <w:p>
+      <w:pPr>
+        <w:pStyle w:val="CommandBlock"/>
+        <w:keepNext/>
+      </w:pPr>
+      <w:r>
+        <w:t>(Get-NetTCPConnection -LocalPort $clientPort -RemotePort 8766).State</w:t>
+      </w:r>
+    </w:p>
+    <w:p>
+      <w:pPr>
+        <w:pStyle w:val="CommandBlock"/>
+      </w:pPr>
+      <w:r>
+        <w:t>(Get-NetTCPConnection -RemotePort $clientPort -ErrorAction Ignore).Count</w:t>
+      </w:r>
+    </w:p>
+    <w:p>
+      <w:pPr>
+        <w:keepNext/>
+      </w:pPr>
+    </w:p>
+    <w:p>
+      <w:pPr>
+        <w:keepNext/>
+      </w:pPr>
+      <w:r>
+        <w:t>The listener is on 127.0.0.1; the client's port is a dynamic port, from 49152 on; both ends of the open connection are Established. After the close, the client's end, which closed first, is in TimeWait, and the server's end is gone:</w:t>
+      </w:r>
+    </w:p>
+    <w:p>
+      <w:pPr>
+        <w:keepNext/>
+      </w:pPr>
+    </w:p>
+    <w:p>
+      <w:pPr>
+        <w:pStyle w:val="RequiredOutput"/>
+        <w:keepNext/>
+      </w:pPr>
+      <w:r>
+        <w:t>127.0.0.1</w:t>
+      </w:r>
+    </w:p>
+    <w:p>
+      <w:pPr>
+        <w:pStyle w:val="RequiredOutput"/>
+        <w:keepNext/>
+      </w:pPr>
+      <w:r>
+        <w:t>True</w:t>
+      </w:r>
+    </w:p>
+    <w:p>
+      <w:pPr>
+        <w:pStyle w:val="RequiredOutput"/>
+        <w:keepNext/>
+      </w:pPr>
+      <w:r>
+        <w:t>Established</w:t>
+      </w:r>
+    </w:p>
+    <w:p>
+      <w:pPr>
+        <w:pStyle w:val="RequiredOutput"/>
+        <w:keepNext/>
+      </w:pPr>
+      <w:r>
+        <w:t>Established</w:t>
+      </w:r>
+    </w:p>
+    <w:p>
+      <w:pPr>
+        <w:pStyle w:val="RequiredOutput"/>
+        <w:keepNext/>
+      </w:pPr>
+      <w:r>
+        <w:t>TimeWait</w:t>
+      </w:r>
+    </w:p>
+    <w:p>
+      <w:pPr>
+        <w:pStyle w:val="RequiredOutput"/>
+      </w:pPr>
+      <w:r>
+        <w:t>0</w:t>
+      </w:r>
+    </w:p>
+    <w:p>
+      <w:pPr>
+        <w:keepNext/>
+      </w:pPr>
+    </w:p>
+    <w:p>
+      <w:r>
+        <w:t>If more than 3000 milliseconds pass before the Close line, for example when you type the lines one by one, the server gives up and closes first: Terminal 1 shows Error: no line from the client within 3000 ms, and the roles turn round. The server's end shows FinWait2, closed and waiting for the client's side, instead of the first Established, and the client's end shows CloseWait, the other side closed and this side not yet, instead of the second. After your Close, the client's end is gone at once, so the Tim</w:t>
+      </w:r>
+      <w:r>
+        <w:t>eWait line prints an error instead, and the count is 1: the server's end, which closed first, is the one in TimeWait.</w:t>
+      </w:r>
+    </w:p>
+    <w:p>
+      <w:pPr>
+        <w:keepNext/>
+      </w:pPr>
+    </w:p>
+    <w:p>
+      <w:pPr>
+        <w:keepNext/>
+      </w:pPr>
+      <w:r>
+        <w:t>Now press Ctrl+C in Terminal 1. Terminal 1 shows the Listening line and one line for the connection, which ended without a line:</w:t>
+      </w:r>
+    </w:p>
+    <w:p>
+      <w:pPr>
+        <w:keepNext/>
+      </w:pPr>
+    </w:p>
+    <w:p>
+      <w:pPr>
+        <w:pStyle w:val="RequiredOutput"/>
+        <w:keepNext/>
+      </w:pPr>
+      <w:r>
+        <w:t>Listening on tcp://127.0.0.1:8766</w:t>
+      </w:r>
+    </w:p>
+    <w:p>
+      <w:pPr>
+        <w:pStyle w:val="RequiredOutput"/>
+      </w:pPr>
+      <w:r>
+        <w:t>No line: the client closed the connection</w:t>
+      </w:r>
+    </w:p>
+    <w:p>
+      <w:pPr>
+        <w:keepNext/>
+      </w:pPr>
+    </w:p>
+    <w:p>
+      <w:pPr>
+        <w:pStyle w:val="Heading3"/>
+      </w:pPr>
+      <w:r>
+        <w:t>Linux or macOS Observation</w:t>
+      </w:r>
+    </w:p>
+    <w:p>
+      <w:pPr>
+        <w:pStyle w:val="CommandBlock"/>
+        <w:keepNext/>
+      </w:pPr>
+      <w:r>
+        <w:t># Terminal 1:</w:t>
+      </w:r>
+    </w:p>
+    <w:p>
+      <w:pPr>
+        <w:pStyle w:val="CommandBlock"/>
+        <w:keepNext/>
+      </w:pPr>
+      <w:r>
+        <w:t>python3 ./python/echo_server.py</w:t>
+      </w:r>
+    </w:p>
+    <w:p>
+      <w:pPr>
+        <w:pStyle w:val="CommandBlock"/>
+        <w:keepNext/>
+      </w:pPr>
+      <w:r>
+        <w:t># Terminal 2: ss lists TCP endpoints: -t TCP, -a every state, -n numbers</w:t>
+      </w:r>
+    </w:p>
+    <w:p>
+      <w:pPr>
+        <w:pStyle w:val="CommandBlock"/>
+        <w:keepNext/>
+      </w:pPr>
+      <w:r>
+        <w:t># (macOS: netstat -an -p tcp | grep 8766)</w:t>
+      </w:r>
+    </w:p>
+    <w:p>
+      <w:pPr>
+        <w:pStyle w:val="CommandBlock"/>
+        <w:keepNext/>
+      </w:pPr>
+      <w:r>
+        <w:t>ss -tan 'sport = :8766'</w:t>
+      </w:r>
+    </w:p>
+    <w:p>
+      <w:pPr>
+        <w:pStyle w:val="CommandBlock"/>
+        <w:keepNext/>
+      </w:pPr>
+      <w:r>
+        <w:t>python3 ./python/echo_client.py</w:t>
+      </w:r>
+    </w:p>
+    <w:p>
+      <w:pPr>
+        <w:pStyle w:val="CommandBlock"/>
+      </w:pPr>
+      <w:r>
+        <w:t>ss -tan 'sport = :8766 or dport = :8766'</w:t>
+      </w:r>
+    </w:p>
+    <w:p>
+      <w:pPr>
+        <w:keepNext/>
+      </w:pPr>
+    </w:p>
+    <w:p>
+      <w:pPr>
+        <w:keepNext/>
+      </w:pPr>
+    </w:p>
+    <w:p>
+      <w:pPr>
+        <w:pStyle w:val="Heading2"/>
+      </w:pPr>
+      <w:r>
         <w:t>What to Notice</w:t>
       </w:r>
     </w:p>
@@ -24570,7 +25021,7 @@
     </w:p>
     <w:p>
       <w:r>
-        <w:t>These files follow the same pattern as the earlier lessons: only the project names change. Remember, each .csproj targets net10.0, go.mod names this lesson's Go module, example.com/tcpsockets, and package.json pins the TypeScript compiler, 7.0.2, and Node's type definitions for this project.</w:t>
+        <w:t>These are the files the setup commands wrote, shown here so you can check yours. Each .csproj targets net10.0, go.mod names this lesson's Go module, example.com/tcpsockets, and package.json pins the TypeScript compiler, 7.0.2, and Node's type definitions for this project. Your go line shows your own Go version, and the blank lines and the order of the package.json fields may differ.</w:t>
       </w:r>
     </w:p>
     <w:p>
@@ -25086,164 +25537,6 @@
       </w:pPr>
       <w:r>
         <w:t xml:space="preserve">  }</w:t>
-      </w:r>
-    </w:p>
-    <w:p>
-      <w:pPr>
-        <w:pStyle w:val="SourceCode"/>
-      </w:pPr>
-      <w:r>
-        <w:t>}</w:t>
-      </w:r>
-    </w:p>
-    <w:p>
-      <w:pPr>
-        <w:keepNext/>
-      </w:pPr>
-    </w:p>
-    <w:p>
-      <w:pPr>
-        <w:keepNext/>
-      </w:pPr>
-    </w:p>
-    <w:p>
-      <w:pPr>
-        <w:pStyle w:val="Heading2"/>
-      </w:pPr>
-      <w:r>
-        <w:t>typescript/tsconfig.json</w:t>
-      </w:r>
-    </w:p>
-    <w:p>
-      <w:pPr>
-        <w:pStyle w:val="SourceCode"/>
-        <w:keepNext/>
-      </w:pPr>
-      <w:r>
-        <w:t>{</w:t>
-      </w:r>
-    </w:p>
-    <w:p>
-      <w:pPr>
-        <w:pStyle w:val="SourceCode"/>
-        <w:keepNext/>
-      </w:pPr>
-      <w:r>
-        <w:t xml:space="preserve">  "compilerOptions": {</w:t>
-      </w:r>
-    </w:p>
-    <w:p>
-      <w:pPr>
-        <w:pStyle w:val="SourceCode"/>
-      </w:pPr>
-      <w:r>
-        <w:t xml:space="preserve">    "target": "ES2022",</w:t>
-      </w:r>
-    </w:p>
-    <w:p>
-      <w:pPr>
-        <w:pStyle w:val="SourceCode"/>
-      </w:pPr>
-      <w:r>
-        <w:t xml:space="preserve">    "module": "NodeNext",</w:t>
-      </w:r>
-    </w:p>
-    <w:p>
-      <w:pPr>
-        <w:pStyle w:val="SourceCode"/>
-      </w:pPr>
-      <w:r>
-        <w:t xml:space="preserve">    "moduleResolution": "NodeNext",</w:t>
-      </w:r>
-    </w:p>
-    <w:p>
-      <w:pPr>
-        <w:pStyle w:val="SourceCode"/>
-      </w:pPr>
-      <w:r>
-        <w:t xml:space="preserve">    "rootDir": "src",</w:t>
-      </w:r>
-    </w:p>
-    <w:p>
-      <w:pPr>
-        <w:pStyle w:val="SourceCode"/>
-      </w:pPr>
-      <w:r>
-        <w:t xml:space="preserve">    "outDir": "dist",</w:t>
-      </w:r>
-    </w:p>
-    <w:p>
-      <w:pPr>
-        <w:pStyle w:val="SourceCode"/>
-      </w:pPr>
-      <w:r>
-        <w:t xml:space="preserve">    "strict": true,</w:t>
-      </w:r>
-    </w:p>
-    <w:p>
-      <w:pPr>
-        <w:pStyle w:val="SourceCode"/>
-      </w:pPr>
-      <w:r>
-        <w:t xml:space="preserve">    "types": [</w:t>
-      </w:r>
-    </w:p>
-    <w:p>
-      <w:pPr>
-        <w:pStyle w:val="SourceCode"/>
-      </w:pPr>
-      <w:r>
-        <w:t xml:space="preserve">      "node"</w:t>
-      </w:r>
-    </w:p>
-    <w:p>
-      <w:pPr>
-        <w:pStyle w:val="SourceCode"/>
-      </w:pPr>
-      <w:r>
-        <w:t xml:space="preserve">    ],</w:t>
-      </w:r>
-    </w:p>
-    <w:p>
-      <w:pPr>
-        <w:pStyle w:val="SourceCode"/>
-      </w:pPr>
-      <w:r>
-        <w:t xml:space="preserve">    "moduleDetection": "force"</w:t>
-      </w:r>
-    </w:p>
-    <w:p>
-      <w:pPr>
-        <w:pStyle w:val="SourceCode"/>
-      </w:pPr>
-      <w:r>
-        <w:t xml:space="preserve">  },</w:t>
-      </w:r>
-    </w:p>
-    <w:p>
-      <w:pPr>
-        <w:pStyle w:val="SourceCode"/>
-      </w:pPr>
-      <w:r>
-        <w:t xml:space="preserve">  "include": [</w:t>
-      </w:r>
-    </w:p>
-    <w:p>
-      <w:pPr>
-        <w:pStyle w:val="SourceCode"/>
-        <w:keepNext/>
-      </w:pPr>
-      <w:r>
-        <w:t xml:space="preserve">    "src/**/*.ts"</w:t>
-      </w:r>
-    </w:p>
-    <w:p>
-      <w:pPr>
-        <w:pStyle w:val="SourceCode"/>
-        <w:keepNext/>
-      </w:pPr>
-      <w:r>
-        <w:t xml:space="preserve">  ]</w:t>
       </w:r>
     </w:p>
     <w:p>
@@ -26364,31 +26657,31 @@
       </w:rPr>
     </w:lvl>
   </w:abstractNum>
-  <w:num w:numId="1" w16cid:durableId="1322274667">
+  <w:num w:numId="1" w16cid:durableId="202444632">
     <w:abstractNumId w:val="8"/>
   </w:num>
-  <w:num w:numId="2" w16cid:durableId="1248537105">
+  <w:num w:numId="2" w16cid:durableId="231041990">
     <w:abstractNumId w:val="6"/>
   </w:num>
-  <w:num w:numId="3" w16cid:durableId="50349188">
+  <w:num w:numId="3" w16cid:durableId="1422339494">
     <w:abstractNumId w:val="5"/>
   </w:num>
-  <w:num w:numId="4" w16cid:durableId="2095973472">
+  <w:num w:numId="4" w16cid:durableId="173616004">
     <w:abstractNumId w:val="4"/>
   </w:num>
-  <w:num w:numId="5" w16cid:durableId="1371614718">
+  <w:num w:numId="5" w16cid:durableId="1544905019">
     <w:abstractNumId w:val="7"/>
   </w:num>
-  <w:num w:numId="6" w16cid:durableId="1424645622">
+  <w:num w:numId="6" w16cid:durableId="1176575016">
     <w:abstractNumId w:val="3"/>
   </w:num>
-  <w:num w:numId="7" w16cid:durableId="1198273988">
+  <w:num w:numId="7" w16cid:durableId="47148160">
     <w:abstractNumId w:val="2"/>
   </w:num>
-  <w:num w:numId="8" w16cid:durableId="1695425692">
+  <w:num w:numId="8" w16cid:durableId="1453550844">
     <w:abstractNumId w:val="1"/>
   </w:num>
-  <w:num w:numId="9" w16cid:durableId="1431045562">
+  <w:num w:numId="9" w16cid:durableId="374819075">
     <w:abstractNumId w:val="0"/>
   </w:num>
 </w:numbering>

</xml_diff>

<commit_message>
Volume 1, Chapter 7: updated lessons
</commit_message>
<xml_diff>
--- a/Volume 1/Chapter 07 - Networking Basics/SPA_Vol1_Ch7_Lesson7_10_TCP_Sockets.docx
+++ b/Volume 1/Chapter 07 - Networking Basics/SPA_Vol1_Ch7_Lesson7_10_TCP_Sockets.docx
@@ -328,7 +328,11 @@
         <w:pStyle w:val="ListBullet"/>
       </w:pPr>
       <w:r>
-        <w:t>The servers serve one client after another; a client that connects while another is served waits in the listen queue. Serving several clients at once is Volume 3, Chapter 5, and waiting on many sockets without blocking (non-blocking I/O and select) is Volume 3, Chapters 8 and 9. Node is the exception you will notice: it runs a function for each event, so its server never waits for one client before the next.</w:t>
+        <w:t xml:space="preserve">The servers serve one client after another; a client that connects while another is served waits in the listen queue. Serving several clients at once is Volume 3, Chapter 5, and waiting on many sockets without </w:t>
+      </w:r>
+      <w:r>
+        <w:lastRenderedPageBreak/>
+        <w:t>blocking (non-blocking I/O and select) is Volume 3, Chapters 8 and 9. Node is the exception you will notice: it runs a function for each event, so its server never waits for one client before the next.</w:t>
       </w:r>
     </w:p>
     <w:p>
@@ -575,6 +579,7 @@
         <w:pStyle w:val="CommandBlock"/>
       </w:pPr>
       <w:r>
+        <w:lastRenderedPageBreak/>
         <w:t xml:space="preserve">  cpp/basic_echo_server.cpp</w:t>
       </w:r>
     </w:p>
@@ -951,6 +956,7 @@
         <w:pStyle w:val="CommandBlock"/>
       </w:pPr>
       <w:r>
+        <w:lastRenderedPageBreak/>
         <w:t>New-Item -ItemType Directory -Force "$HOME\spa\lesson-7.10\go\server" | Out-Null</w:t>
       </w:r>
     </w:p>
@@ -1331,6 +1337,7 @@
         <w:keepNext/>
       </w:pPr>
       <w:r>
+        <w:lastRenderedPageBreak/>
         <w:t xml:space="preserve">    "src/**/*.ts"</w:t>
       </w:r>
     </w:p>
@@ -3490,23 +3497,23 @@
         <w:pStyle w:val="SourceCode"/>
       </w:pPr>
       <w:r>
-        <w:t>// A recv gives whatever bytes have arrived, which may be part of a line,</w:t>
-      </w:r>
-    </w:p>
-    <w:p>
-      <w:pPr>
-        <w:pStyle w:val="SourceCode"/>
-      </w:pPr>
-      <w:r>
-        <w:t>// so it keeps reading until a \n is there. The line must fit in</w:t>
-      </w:r>
-    </w:p>
-    <w:p>
-      <w:pPr>
-        <w:pStyle w:val="SourceCode"/>
-      </w:pPr>
-      <w:r>
-        <w:t>// MAX_LINE_BYTES, so a client can never make the server keep collecting.</w:t>
+        <w:t>// A recv may give part of a line, so it keeps reading until a \n is there;</w:t>
+      </w:r>
+    </w:p>
+    <w:p>
+      <w:pPr>
+        <w:pStyle w:val="SourceCode"/>
+      </w:pPr>
+      <w:r>
+        <w:t>// *strchr(line, '\n') = '\0' then writes the end of the text over the \n.</w:t>
+      </w:r>
+    </w:p>
+    <w:p>
+      <w:pPr>
+        <w:pStyle w:val="SourceCode"/>
+      </w:pPr>
+      <w:r>
+        <w:t>// It stops at MAX_LINE_BYTES, so a client can never keep the server reading.</w:t>
       </w:r>
     </w:p>
     <w:p>
@@ -5132,15 +5139,15 @@
         <w:pStyle w:val="SourceCode"/>
       </w:pPr>
       <w:r>
-        <w:t>// Prints the time since start in whole milliseconds. Remember,</w:t>
-      </w:r>
-    </w:p>
-    <w:p>
-      <w:pPr>
-        <w:pStyle w:val="SourceCode"/>
-      </w:pPr>
-      <w:r>
-        <w:t>// QueryPerformanceCounter is a clock that only moves forward (Lesson 7.4).</w:t>
+        <w:t>// Prints the time since start in whole milliseconds. Remember, the counter</w:t>
+      </w:r>
+    </w:p>
+    <w:p>
+      <w:pPr>
+        <w:pStyle w:val="SourceCode"/>
+      </w:pPr>
+      <w:r>
+        <w:t>// only moves forward, and a LARGE_INTEGER's QuadPart holds it (Lesson 7.4).</w:t>
       </w:r>
     </w:p>
     <w:p>
@@ -5310,15 +5317,15 @@
         <w:pStyle w:val="SourceCode"/>
       </w:pPr>
       <w:r>
-        <w:t xml:space="preserve">    // arrays first; the four NULLs are details it can give back, which are</w:t>
-      </w:r>
-    </w:p>
-    <w:p>
-      <w:pPr>
-        <w:pStyle w:val="SourceCode"/>
-      </w:pPr>
-      <w:r>
-        <w:t xml:space="preserve">    // not needed here.</w:t>
+        <w:t xml:space="preserve">    // arrays first; the first four NULLs are details it can give back, not</w:t>
+      </w:r>
+    </w:p>
+    <w:p>
+      <w:pPr>
+        <w:pStyle w:val="SourceCode"/>
+      </w:pPr>
+      <w:r>
+        <w:t xml:space="preserve">    // needed here, and the last is a reserved place that must be NULL.</w:t>
       </w:r>
     </w:p>
     <w:p>
@@ -9625,15 +9632,15 @@
         <w:pStyle w:val="SourceCode"/>
       </w:pPr>
       <w:r>
-        <w:t xml:space="preserve">    // data(); the four nullptrs are details it can give back, not needed</w:t>
-      </w:r>
-    </w:p>
-    <w:p>
-      <w:pPr>
-        <w:pStyle w:val="SourceCode"/>
-      </w:pPr>
-      <w:r>
-        <w:t xml:space="preserve">    // here.</w:t>
+        <w:t xml:space="preserve">    // data(); the first four nullptrs are details it can give back, not</w:t>
+      </w:r>
+    </w:p>
+    <w:p>
+      <w:pPr>
+        <w:pStyle w:val="SourceCode"/>
+      </w:pPr>
+      <w:r>
+        <w:t xml:space="preserve">    // needed here, and the last is a reserved place that must be nullptr.</w:t>
       </w:r>
     </w:p>
     <w:p>
@@ -10744,7 +10751,7 @@
         <w:pStyle w:val="SourceCode"/>
       </w:pPr>
       <w:r>
-        <w:t xml:space="preserve">        // address text (Lesson 7.1).</w:t>
+        <w:t xml:space="preserve">        // address text and throws on bad text (Lesson 7.4).</w:t>
       </w:r>
     </w:p>
     <w:p>
@@ -20192,7 +20199,7 @@
         <w:pStyle w:val="SourceCode"/>
       </w:pPr>
       <w:r>
-        <w:t xml:space="preserve">    why there was no line."""</w:t>
+        <w:t xml:space="preserve">    why there was no line. Remember, side-by-side literals join."""</w:t>
       </w:r>
     </w:p>
     <w:p>
@@ -26657,31 +26664,31 @@
       </w:rPr>
     </w:lvl>
   </w:abstractNum>
-  <w:num w:numId="1" w16cid:durableId="202444632">
+  <w:num w:numId="1" w16cid:durableId="1318998341">
     <w:abstractNumId w:val="8"/>
   </w:num>
-  <w:num w:numId="2" w16cid:durableId="231041990">
+  <w:num w:numId="2" w16cid:durableId="1810397336">
     <w:abstractNumId w:val="6"/>
   </w:num>
-  <w:num w:numId="3" w16cid:durableId="1422339494">
+  <w:num w:numId="3" w16cid:durableId="434206562">
     <w:abstractNumId w:val="5"/>
   </w:num>
-  <w:num w:numId="4" w16cid:durableId="173616004">
+  <w:num w:numId="4" w16cid:durableId="429620813">
     <w:abstractNumId w:val="4"/>
   </w:num>
-  <w:num w:numId="5" w16cid:durableId="1544905019">
+  <w:num w:numId="5" w16cid:durableId="1864660328">
     <w:abstractNumId w:val="7"/>
   </w:num>
-  <w:num w:numId="6" w16cid:durableId="1176575016">
+  <w:num w:numId="6" w16cid:durableId="1366903214">
     <w:abstractNumId w:val="3"/>
   </w:num>
-  <w:num w:numId="7" w16cid:durableId="47148160">
+  <w:num w:numId="7" w16cid:durableId="1439980824">
     <w:abstractNumId w:val="2"/>
   </w:num>
-  <w:num w:numId="8" w16cid:durableId="1453550844">
+  <w:num w:numId="8" w16cid:durableId="1678532568">
     <w:abstractNumId w:val="1"/>
   </w:num>
-  <w:num w:numId="9" w16cid:durableId="374819075">
+  <w:num w:numId="9" w16cid:durableId="401561901">
     <w:abstractNumId w:val="0"/>
   </w:num>
 </w:numbering>

</xml_diff>